<commit_message>
Compress Set 3 report to ~2500 words (md + docx)
Tightens the prose from ~2900 to 2401 words to fit the 6-8 page limit once figures are included, while keeping all 13 figures, every metric, the unique headings and Harvard references. Regenerates the .docx from the trimmed report.
</commit_message>
<xml_diff>
--- a/Set 3/GAN_Assignment_Set3_Report.docx
+++ b/Set 3/GAN_Assignment_Set3_Report.docx
@@ -27,7 +27,7 @@
       </w:pPr>
       <w:r>
         <w:rPr/>
-        <w:t xml:space="preserve">This report accompanies the GAN notebook and documents what was built, why each design choice was made, and what the experiments actually showed. Part 1 builds two generative adversarial networks (GANs) from scratch on synthetic two-dimensional data and studies how an architecture change affects them. Part 2 applies GANs to three very different real-world problems — medical imaging, network-security traffic, and hand-drawn sketches — because each domain stresses the model in a different way and therefore justifies a different design. Two frameworks were used deliberately: PyTorch for the from-scratch and sketch work, and TensorFlow/Keras for the medical and tabular models, with fixed seeds (</w:t>
+        <w:t xml:space="preserve">This report documents what was built across the notebook, why each design was chosen, and what the experiments showed. Part 1 builds two GANs from scratch on synthetic 2D data and studies an architecture change; Part 2 applies GANs to three contrasting domains — medical imaging, network-security traffic and hand-drawn sketches — each of which stresses the model differently and so justifies a different design. Two frameworks are used deliberately: PyTorch for the from-scratch and sketch work, TensorFlow/Keras for the medical and tabular models. Seeds are fixed (</w:t>
       </w:r>
       <w:r>
         <w:rPr>
@@ -47,17 +47,17 @@
       </w:r>
       <w:r>
         <w:rPr/>
-        <w:t xml:space="preserve">) so every figure and number quoted below is reproducible.</w:t>
-      </w:r>
-    </w:p>
-    <w:p>
-      <w:pPr>
-        <w:spacing w:after="160"/>
-        <w:jc w:val="both"/>
-      </w:pPr>
-      <w:r>
-        <w:rPr/>
-        <w:t xml:space="preserve">Every model here rests on the same adversarial idea introduced by Goodfellow </w:t>
+        <w:t xml:space="preserve">) so every number below is reproducible.</w:t>
+      </w:r>
+    </w:p>
+    <w:p>
+      <w:pPr>
+        <w:spacing w:after="160"/>
+        <w:jc w:val="both"/>
+      </w:pPr>
+      <w:r>
+        <w:rPr/>
+        <w:t xml:space="preserve">Every model rests on the adversarial idea of Goodfellow </w:t>
       </w:r>
       <w:r>
         <w:rPr>
@@ -67,7 +67,7 @@
       </w:r>
       <w:r>
         <w:rPr/>
-        <w:t xml:space="preserve"> (2014): two networks are trained in competition, one proposing samples from random noise and the other scoring how plausible those samples look, so that the scorer's feedback steadily pushes the proposer towards more realistic output. The non-saturating binary cross-entropy formulation is used throughout. Where the data is imagery, the convolutional DCGAN formulation of Radford </w:t>
+        <w:t xml:space="preserve"> (2014): a generator maps noise to samples while a discriminator scores how real they look, and the two train in competition under the non-saturating binary cross-entropy objective. Image data uses the convolutional DCGAN of Radford </w:t>
       </w:r>
       <w:r>
         <w:rPr>
@@ -77,7 +77,7 @@
       </w:r>
       <w:r>
         <w:rPr/>
-        <w:t xml:space="preserve"> (2016) is used; where it is tabular, a fully-connected variant is used instead. This report prioritises interpretation of the results over description of the code.</w:t>
+        <w:t xml:space="preserve"> (2016); tabular data uses a fully-connected variant. Throughout, the emphasis is on interpreting results rather than restating code.</w:t>
       </w:r>
     </w:p>
     <w:p>
@@ -96,7 +96,7 @@
       </w:pPr>
       <w:r>
         <w:rPr/>
-        <w:t xml:space="preserve">Part 1 was implemented entirely in PyTorch. Both networks are small multilayer perceptrons trained with </w:t>
+        <w:t xml:space="preserve">Both networks are small MLPs trained with </w:t>
       </w:r>
       <w:r>
         <w:rPr>
@@ -106,7 +106,7 @@
       </w:r>
       <w:r>
         <w:rPr/>
-        <w:t xml:space="preserve">, one discriminator update per generator update, using Adam (learning rate 2e-4, β = 0.5, 0.999) as recommended for GAN stability by Radford </w:t>
+        <w:t xml:space="preserve">, one discriminator step per generator step, using Adam (2e-4, β = 0.5, 0.999) as recommended for GAN stability (Radford </w:t>
       </w:r>
       <w:r>
         <w:rPr>
@@ -116,7 +116,7 @@
       </w:r>
       <w:r>
         <w:rPr/>
-        <w:t xml:space="preserve"> (2016) and Kingma and Ba (2015). A single configurable pair of classes serves all three tasks, which keeps the comparison in Task 3 fair because only the changed hyper-parameters differ.</w:t>
+        <w:t xml:space="preserve">, 2016; Kingma and Ba, 2015). One configurable pair of classes serves all three tasks, so the Task 3 comparison is fair — only the changed hyper-parameters differ.</w:t>
       </w:r>
     </w:p>
     <w:p>
@@ -135,7 +135,7 @@
       </w:pPr>
       <w:r>
         <w:rPr/>
-        <w:t xml:space="preserve">The target is points sampled along </w:t>
+        <w:t xml:space="preserve">The target is points on </w:t>
       </w:r>
       <w:r>
         <w:rPr>
@@ -155,7 +155,7 @@
       </w:r>
       <w:r>
         <w:rPr/>
-        <w:t xml:space="preserve">). Training ran for 6000 steps from a 32-dimensional latent vector.</w:t>
+        <w:t xml:space="preserve">); training ran 6000 steps from a 32-D latent vector.</w:t>
       </w:r>
     </w:p>
     <w:p>
@@ -224,7 +224,7 @@
       </w:pPr>
       <w:r>
         <w:rPr/>
-        <w:t xml:space="preserve">Figure 1 shows the generated cloud lying almost exactly on the sine curve, and the loss trace supports this rather than contradicting it. The discriminator settles at roughly 1.35–1.39 (final 1.3796) and the generator at roughly 0.68–0.76 (final 0.6979), which is close to the theoretical equilibrium for this objective — about 2ln2 ≈ 1.386 for D and ln2 ≈ 0.693 for G. Neither network runs away from the other, so the model has reached the balanced state that indicates genuine convergence rather than one side dominating.</w:t>
+        <w:t xml:space="preserve">Figure 1 shows the generated cloud lying almost exactly on the curve, and the losses agree: the discriminator settles at 1.35–1.39 (final 1.3796) and the generator at 0.68–0.76 (final 0.6979), close to this objective's equilibrium (≈ 2ln2 = 1.386 for D, ln2 = 0.693 for G). Neither loss runs away, indicating genuine convergence rather than one network dominating.</w:t>
       </w:r>
     </w:p>
     <w:p>
@@ -243,7 +243,7 @@
       </w:pPr>
       <w:r>
         <w:rPr/>
-        <w:t xml:space="preserve">The chosen distribution is the noisy parametric curve </w:t>
+        <w:t xml:space="preserve">The new target is </w:t>
       </w:r>
       <w:r>
         <w:rPr>
@@ -273,7 +273,7 @@
       </w:r>
       <w:r>
         <w:rPr/>
-        <w:t xml:space="preserve">) + ε, with ε a small Gaussian noise term. This is harder than the plain sine because of the higher-frequency second term and the noise band, and it ran for 8000 steps.</w:t>
+        <w:t xml:space="preserve">) + ε (ε a small Gaussian noise term) — harder than the sine because of the higher-frequency term and the noise band; 8000 steps.</w:t>
       </w:r>
     </w:p>
     <w:p>
@@ -342,7 +342,7 @@
       </w:pPr>
       <w:r>
         <w:rPr/>
-        <w:t xml:space="preserve">Figure 2 shows the generator tracing the full double-bump shape and, importantly, spreading its points into the same noisy band as the real data rather than collapsing onto a single thin line. This means it has learned the variance of the target and not merely its mean trend. The losses stay healthy across the run (D between 1.1652 and 1.3705, G between 0.7229 and 0.8429) and are slightly noisier than in Task 1, which is the expected consequence of a more oscillatory, higher-frequency target.</w:t>
+        <w:t xml:space="preserve">Figure 2 shows the generator tracing the double-bump shape and spreading its points into the same noisy band as the real data rather than collapsing to a thin line, so it learns the target's variance and not just its mean trend. Losses stay healthy (D 1.1652–1.3705, G 0.7229–0.8429), a little noisier than Task 1 as expected for a more oscillatory target.</w:t>
       </w:r>
     </w:p>
     <w:p>
@@ -361,7 +361,7 @@
       </w:pPr>
       <w:r>
         <w:rPr/>
-        <w:t xml:space="preserve">To test sensitivity to architecture, the baseline generator (depth 2, ReLU) was compared against a deeper variant (depth 4, ELU) on the same target and training budget, changing only the generator.</w:t>
+        <w:t xml:space="preserve">The baseline generator (depth 2, ReLU) is compared against a deeper variant (depth 4, ELU) on the same target and budget, changing only the generator.</w:t>
       </w:r>
     </w:p>
     <w:p>
@@ -430,7 +430,7 @@
       </w:pPr>
       <w:r>
         <w:rPr/>
-        <w:t xml:space="preserve">Figure 3 shows a visible but modest improvement: the deeper ELU generator sits slightly tighter around the curve and leaves fewer stray points drifting off the shape. Its losses remained stable (final D 1.3821, G 0.7089), so the extra depth did not introduce optimisation problems. The improvement being incremental rather than dramatic is itself informative — a 2D curve is simple enough that the shallow baseline already captures most of the structure, so added capacity has limited room to help.</w:t>
+        <w:t xml:space="preserve">Figure 3 shows a visible but modest gain: the deeper ELU generator sits slightly tighter around the curve with fewer stray points, and its losses stay stable (final D 1.3821, G 0.7089), so the added depth caused no optimisation trouble. That the gain is small is itself informative — a 2D curve is simple enough that the shallow baseline already captures most of the structure.</w:t>
       </w:r>
     </w:p>
     <w:p>
@@ -464,7 +464,7 @@
       </w:r>
       <w:r>
         <w:rPr/>
-        <w:t xml:space="preserve"> The OCTMNIST subset of MedMNIST (Yang </w:t>
+        <w:t xml:space="preserve"> OCTMNIST (Yang </w:t>
       </w:r>
       <w:r>
         <w:rPr>
@@ -474,7 +474,7 @@
       </w:r>
       <w:r>
         <w:rPr/>
-        <w:t xml:space="preserve">, 2023) provides 97,477 training scans of 28×28 pixels across four diagnostic classes: choroidal neovascularisation, diabetic macular edema, drusen, and normal. Images were rescaled to 32×32 in the [−1, 1] range to match the generator's </w:t>
+        <w:t xml:space="preserve">, 2023) provides 97,477 training scans of 28×28 pixels in four diagnostic classes (choroidal neovascularisation, diabetic macular edema, drusen, normal), rescaled to 32×32 in [−1, 1] to match the generator's </w:t>
       </w:r>
       <w:r>
         <w:rPr>
@@ -484,7 +484,7 @@
       </w:r>
       <w:r>
         <w:rPr/>
-        <w:t xml:space="preserve"> output. A DCGAN (Radford </w:t>
+        <w:t xml:space="preserve">. A DCGAN (Radford </w:t>
       </w:r>
       <w:r>
         <w:rPr>
@@ -494,7 +494,7 @@
       </w:r>
       <w:r>
         <w:rPr/>
-        <w:t xml:space="preserve">, 2016) was chosen because OCT scans have strong local spatial structure — a curved retinal band over a dark background — which convolutions capture far more efficiently than a dense network. The generator upsamples a 100-dimensional latent vector through transposed convolutions; the discriminator mirrors this with strided convolutions and dropout of 0.3. Training used a manual </w:t>
+        <w:t xml:space="preserve">, 2016) suits the strong local structure of a scan — a curved retinal band on a dark background — which convolutions capture far more efficiently than a dense network. The generator upsamples a 100-D latent vector via transposed convolutions; the discriminator mirrors it with strided convolutions and 0.3 dropout. Training used a manual </w:t>
       </w:r>
       <w:r>
         <w:rPr>
@@ -504,7 +504,7 @@
       </w:r>
       <w:r>
         <w:rPr/>
-        <w:t xml:space="preserve"> loop for 35 epochs with one-sided label smoothing (real labels set to 0.9), a technique from Salimans </w:t>
+        <w:t xml:space="preserve"> loop for 35 epochs with one-sided label smoothing (real labels 0.9), which stops the discriminator over-confidently starving the generator of gradient (Salimans </w:t>
       </w:r>
       <w:r>
         <w:rPr>
@@ -514,7 +514,7 @@
       </w:r>
       <w:r>
         <w:rPr/>
-        <w:t xml:space="preserve"> (2016) that stops the discriminator becoming over-confident and starving the generator of gradient.</w:t>
+        <w:t xml:space="preserve">, 2016).</w:t>
       </w:r>
     </w:p>
     <w:p>
@@ -583,7 +583,7 @@
       </w:pPr>
       <w:r>
         <w:rPr/>
-        <w:t xml:space="preserve">Figure 4 shows the dataset is imbalanced, with the four classes represented very unequally. This matters later: an imbalanced training set is exactly the condition under which a class-conditional generator produces uneven quality, and it frames the interpretation of the conditional results below.</w:t>
+        <w:t xml:space="preserve">Figure 4 shows the four classes are unevenly represented. This is relevant later: an imbalanced training set is the condition under which a class-conditional generator gives uneven quality.</w:t>
       </w:r>
     </w:p>
     <w:p>
@@ -652,7 +652,7 @@
       </w:pPr>
       <w:r>
         <w:rPr/>
-        <w:t xml:space="preserve">Figure 5 shows neither network diverging. The discriminator stays around 1.1–1.34 and the generator around 0.75–1.28, oscillating within a stable band rather than collapsing — the healthy adversarial signature. This stability is what makes the sample quality in Figure 6 believable rather than accidental.</w:t>
+        <w:t xml:space="preserve">Figure 5 shows neither network diverging — the discriminator holds around 1.1–1.34 and the generator around 0.75–1.28, oscillating within a stable band. That stability is what makes the sample quality below meaningful rather than accidental.</w:t>
       </w:r>
     </w:p>
     <w:p>
@@ -721,7 +721,7 @@
       </w:pPr>
       <w:r>
         <w:rPr/>
-        <w:t xml:space="preserve">Figure 6 shows the generator reproduces the main anatomy — a bright, curved retinal band on a darker background — with genuine variation in band position and curvature across the batch, so it is not memorising one image. The clear weakness is fine detail: the fakes look softer than the real scans and lose the sharp sub-layer texture and speckle. Quantitatively, the model scores </w:t>
+        <w:t xml:space="preserve">Figure 6 shows the generator reproduces the main anatomy with real variation in band position and curvature, so it is not memorising one image; its weakness is fine detail — the fakes are softer and lose sub-layer texture and speckle. It scores </w:t>
       </w:r>
       <w:r>
         <w:rPr>
@@ -741,7 +741,7 @@
       </w:r>
       <w:r>
         <w:rPr/>
-        <w:t xml:space="preserve">, 2017). This is a believable mid-range value for a 35-epoch DCGAN, but it should be read cautiously: FID here pushes 28×28 medical grayscale (upscaled to 32×32) through an InceptionV3 (Szegedy </w:t>
+        <w:t xml:space="preserve">, 2017), a believable mid-range value for a 35-epoch DCGAN, though read cautiously: FID passes 28×28 grayscale (upscaled) through an ImageNet-trained InceptionV3 (Szegedy </w:t>
       </w:r>
       <w:r>
         <w:rPr>
@@ -751,7 +751,7 @@
       </w:r>
       <w:r>
         <w:rPr/>
-        <w:t xml:space="preserve">, 2016) trained on natural ImageNet photographs, a domain the metric was never calibrated for, so it is best treated as an indicator rather than an absolute benchmark.</w:t>
+        <w:t xml:space="preserve">, 2016), a domain it was never calibrated for, so it is indicative rather than absolute.</w:t>
       </w:r>
     </w:p>
     <w:p>
@@ -767,7 +767,7 @@
       </w:r>
       <w:r>
         <w:rPr/>
-        <w:t xml:space="preserve"> For extra credit the DCGAN was made conditional (Mirza and Osindero, 2014) by concatenating a class embedding onto the latent vector and feeding the label to the discriminator as an extra channel.</w:t>
+        <w:t xml:space="preserve"> The DCGAN was made conditional (Mirza and Osindero, 2014) by concatenating a class embedding onto the latent vector and feeding the label to the discriminator as an extra channel.</w:t>
       </w:r>
     </w:p>
     <w:p>
@@ -836,7 +836,7 @@
       </w:pPr>
       <w:r>
         <w:rPr/>
-        <w:t xml:space="preserve">Figure 7 shows visibly different scans from row to row, confirming the generator uses the label rather than ignoring it. Quality is uneven across classes, and the better-represented classes look sharper — the direct consequence of the imbalance seen in Figure 4.</w:t>
+        <w:t xml:space="preserve">Figure 7 shows visibly different scans per row, so the label steers the output rather than being ignored; better-represented classes look sharper — the direct effect of the imbalance in Figure 4.</w:t>
       </w:r>
     </w:p>
     <w:p>
@@ -852,7 +852,7 @@
       </w:r>
       <w:r>
         <w:rPr/>
-        <w:t xml:space="preserve"> The brief asks for a note on GANs "generating ducks". The reference is the duck test: if something looks like a duck and quacks like a duck, it is assumed to be one. A GAN exploits exactly this shortcut, because the discriminator only ever judges whether an image </w:t>
+        <w:t xml:space="preserve"> The duck test — if it looks and quacks like a duck, assume it is one — captures a real risk here. The discriminator only judges whether an image </w:t>
       </w:r>
       <w:r>
         <w:rPr>
@@ -862,7 +862,7 @@
       </w:r>
       <w:r>
         <w:rPr/>
-        <w:t xml:space="preserve"> real, never whether it is anatomically correct. Nothing in training prevents the generator from drawing a convincing structure that corresponds to no real scan — inventing a bright region that reads like pathology, or smoothing over a genuine feature. This is precisely why synthetic OCT images are useful for augmentation or teaching but must never be treated as diagnostic ground truth, and why any classifier trained on mixed real and synthetic data should be re-validated on real-only data.</w:t>
+        <w:t xml:space="preserve"> real, never whether it is anatomically correct, so nothing stops the generator inventing convincing structure that matches no real scan (a bright region reading as pathology, or a smoothed-over feature). Synthetic OCT images are therefore fine for augmentation or teaching but never diagnostic ground truth, and any model trained on mixed data should be re-validated on real-only data.</w:t>
       </w:r>
     </w:p>
     <w:p>
@@ -897,7 +897,7 @@
       </w:r>
       <w:r>
         <w:rPr/>
-        <w:t xml:space="preserve">, 2018) was downloaded directly through </w:t>
+        <w:t xml:space="preserve">, 2018) was pulled via </w:t>
       </w:r>
       <w:r>
         <w:rPr>
@@ -907,7 +907,7 @@
       </w:r>
       <w:r>
         <w:rPr/>
-        <w:t xml:space="preserve"> and the eight per-day capture files were combined into a single frame of </w:t>
+        <w:t xml:space="preserve"> and its eight daily files combined into </w:t>
       </w:r>
       <w:r>
         <w:rPr>
@@ -917,17 +917,17 @@
       </w:r>
       <w:r>
         <w:rPr/>
-        <w:t xml:space="preserve">, of which </w:t>
-      </w:r>
-      <w:r>
-        <w:rPr>
-          <w:b/>
-        </w:rPr>
-        <w:t xml:space="preserve">78 are numeric features</w:t>
-      </w:r>
-      <w:r>
-        <w:rPr/>
-        <w:t xml:space="preserve">. Because each flow is a feature vector rather than an image, a dense (fully-connected) GAN was used instead of a DCGAN — convolutions have no meaningful spatial axis to exploit here. The generator widens 128→256 with batch normalisation and ReLU and ends in a linear layer (the standardised features are unbounded, so no </w:t>
+        <w:t xml:space="preserve"> (</w:t>
+      </w:r>
+      <w:r>
+        <w:rPr>
+          <w:b/>
+        </w:rPr>
+        <w:t xml:space="preserve">78 numeric features</w:t>
+      </w:r>
+      <w:r>
+        <w:rPr/>
+        <w:t xml:space="preserve">). Because each flow is a feature vector, a dense GAN replaces the DCGAN — there is no spatial axis for convolutions. The generator widens 128→256 (batch norm, ReLU) ending in a linear layer (standardised features are unbounded, so no </w:t>
       </w:r>
       <w:r>
         <w:rPr>
@@ -937,7 +937,7 @@
       </w:r>
       <w:r>
         <w:rPr/>
-        <w:t xml:space="preserve">), and the discriminator narrows 256→128 with LeakyReLU and dropout. The latent dimension is 48 and training ran for 60 epochs.</w:t>
+        <w:t xml:space="preserve">); the discriminator narrows 256→128 (LeakyReLU, dropout). Latent dimension 48, 60 epochs.</w:t>
       </w:r>
     </w:p>
     <w:p>
@@ -1006,7 +1006,7 @@
       </w:pPr>
       <w:r>
         <w:rPr/>
-        <w:t xml:space="preserve">Figure 8 shows severe class imbalance: BENIGN dominates at 2,273,097 flows, while rare attacks such as Heartbleed (11), SQL Injection (21) and Infiltration (36) barely appear. The log scale is necessary precisely because of this spread. Following the brief, the model was trained on the </w:t>
+        <w:t xml:space="preserve">Figure 8 shows severe imbalance: BENIGN dominates at 2,273,097 flows while Heartbleed (11), SQL Injection (21) and Infiltration (36) barely appear, hence the log scale. Per the brief, the model trained on the </w:t>
       </w:r>
       <w:r>
         <w:rPr>
@@ -1016,7 +1016,7 @@
       </w:r>
       <w:r>
         <w:rPr/>
-        <w:t xml:space="preserve"> (691,406 rows: 440,031 BENIGN plus DoS Hulk, GoldenEye, slowloris and Slowhttptest), on a sampled 20,000 rows. Features were standardised and clipped to ±5σ, which was essential to stop CICIDS's extreme outliers (and 4,376 infinite / 1,358 missing values) from destabilising training.</w:t>
+        <w:t xml:space="preserve"> (691,406 rows: 440,031 BENIGN plus DoS Hulk, GoldenEye, slowloris and Slowhttptest) using a sampled 20,000 rows, standardised and clipped to ±5σ to stop extreme outliers (and 4,376 infinite, 1,358 missing values) destabilising training.</w:t>
       </w:r>
     </w:p>
     <w:p>
@@ -1085,7 +1085,7 @@
       </w:pPr>
       <w:r>
         <w:rPr/>
-        <w:t xml:space="preserve">Figure 9 shows stable training: the discriminator drifts down from about 1.13 to 0.87 while the generator rises from about 1.11 to 1.73. The steadily rising generator loss against a controlled discriminator is typical of a dense GAN settling, and matches the reasonable distributional overlap seen next.</w:t>
+        <w:t xml:space="preserve">Figure 9 shows stable training: the discriminator drifts from about 1.13 to 0.87 while the generator rises from about 1.11 to 1.73 — a rising generator loss against a controlled discriminator, typical of a dense GAN settling.</w:t>
       </w:r>
     </w:p>
     <w:p>
@@ -1213,7 +1213,7 @@
       </w:pPr>
       <w:r>
         <w:rPr/>
-        <w:t xml:space="preserve">Figures 10 and 11 tell a consistent story. In both the linear PCA view and the non-linear t-SNE view (van der Maaten and Hinton, 2008), the synthetic points fall inside the main mass of real traffic rather than forming a separate blob, so the generator has found the correct region of feature space. However, the synthetic cloud is noticeably tighter than the real one and does not reach into the tails. The alignment-gap metrics quantify this: on the Wednesday data the mean absolute error in per-feature means is </w:t>
+        <w:t xml:space="preserve">Figures 10 and 11 agree: in both the linear PCA and non-linear t-SNE views (van der Maaten and Hinton, 2008) the synthetic points sit inside the main mass of real traffic rather than forming a separate blob, so the generator found the right region of feature space. However, the synthetic cloud is tighter than the real one and misses the tails. The alignment gaps quantify this — mean absolute per-feature error of </w:t>
       </w:r>
       <w:r>
         <w:rPr>
@@ -1223,7 +1223,7 @@
       </w:r>
       <w:r>
         <w:rPr/>
-        <w:t xml:space="preserve"> while the error in per-feature standard deviations is </w:t>
+        <w:t xml:space="preserve"> for means and </w:t>
       </w:r>
       <w:r>
         <w:rPr>
@@ -1233,7 +1233,7 @@
       </w:r>
       <w:r>
         <w:rPr/>
-        <w:t xml:space="preserve">, meaning the generator matches average feature values well but understates how far each feature actually spreads.</w:t>
+        <w:t xml:space="preserve"> for standard deviations — so averages are matched well but spread is understated.</w:t>
       </w:r>
     </w:p>
     <w:p>
@@ -1249,7 +1249,7 @@
       </w:r>
       <w:r>
         <w:rPr/>
-        <w:t xml:space="preserve"> Retraining the same model on 30,000 rows sampled from all eight days gave a mildly counter-intuitive result: the alignment gaps </w:t>
+        <w:t xml:space="preserve"> Retraining on 30,000 rows from all eight days </w:t>
       </w:r>
       <w:r>
         <w:rPr>
@@ -1259,7 +1259,7 @@
       </w:r>
       <w:r>
         <w:rPr/>
-        <w:t xml:space="preserve"> on both statistics (mean </w:t>
+        <w:t xml:space="preserve"> both gaps (</w:t>
       </w:r>
       <w:r>
         <w:rPr>
@@ -1269,7 +1269,7 @@
       </w:r>
       <w:r>
         <w:rPr/>
-        <w:t xml:space="preserve">, std </w:t>
+        <w:t xml:space="preserve"> / </w:t>
       </w:r>
       <w:r>
         <w:rPr>
@@ -1279,17 +1279,7 @@
       </w:r>
       <w:r>
         <w:rPr/>
-        <w:t xml:space="preserve"> versus 0.1227 and 0.2780 for Wednesday only). A single unconditional generator would normally fit </w:t>
-      </w:r>
-      <w:r>
-        <w:rPr>
-          <w:i/>
-        </w:rPr>
-        <w:t xml:space="preserve">worse</w:t>
-      </w:r>
-      <w:r>
-        <w:rPr/>
-        <w:t xml:space="preserve"> when asked to cover many attack families at once, so the extra data volume appears to offset the extra diversity here. The model almost certainly still leans towards BENIGN and the high-volume attacks; the rare classes (Heartbleed, Infiltration, SQL Injection) are too sparse to be represented well even after combining every day. It is worth noting the brief's "DDoS" label: the Wednesday attacks are single-source DoS, and genuine DDoS traffic only appears in the Friday file, which is included in this extension.</w:t>
+        <w:t xml:space="preserve"> versus 0.1227 / 0.2780). A single unconditional generator would usually fit worse across many attack families, so the extra data volume appears to offset the added diversity; the model still leans towards BENIGN and the high-volume attacks, and the rare classes stay under-represented. Note the brief's "DDoS" label — Wednesday's attacks are single-source DoS, and true DDoS only appears in the Friday file, which is included here.</w:t>
       </w:r>
     </w:p>
     <w:p>
@@ -1305,7 +1295,7 @@
       </w:r>
       <w:r>
         <w:rPr/>
-        <w:t xml:space="preserve"> The duck test applies even more sharply to tabular traffic. A generated flow only needs to look statistically like real traffic to satisfy the discriminator, which is a far weaker bar than behaving like a real attack. If such data were used to augment an intrusion-detection dataset, a fake "attack" matching no real signature could teach a classifier the wrong pattern and let real attacks slip through, while a drifting "benign" row could raise false alarms. Because 78 numeric features cannot be sanity-checked by eye the way an image can, the per-feature alignment gaps — especially the standard-deviation gap where such drift first appears — are the main defence against this failure mode.</w:t>
+        <w:t xml:space="preserve"> The duck test bites harder on tabular data: a generated flow only has to look statistically like traffic, not behave like a real attack. Used to augment an intrusion-detection set, a fake "attack" matching no real signature could teach the wrong pattern and miss real attacks, while a drifting "benign" row could raise false alarms. Since 78 numbers cannot be eyeballed like an image, the per-feature gaps — especially the standard-deviation gap where such drift shows first — are the main safeguard.</w:t>
       </w:r>
     </w:p>
     <w:p>
@@ -1340,7 +1330,7 @@
       </w:r>
       <w:r>
         <w:rPr/>
-        <w:t xml:space="preserve"> category (Ha and Eck, 2018) provides </w:t>
+        <w:t xml:space="preserve"> set (Ha and Eck, 2018) provides </w:t>
       </w:r>
       <w:r>
         <w:rPr>
@@ -1350,7 +1340,7 @@
       </w:r>
       <w:r>
         <w:rPr/>
-        <w:t xml:space="preserve"> 28×28 bitmaps. A PyTorch DCGAN with a 128-dimensional latent vector was trained for 30 epochs using the DCGAN weight initialisation of Radford </w:t>
+        <w:t xml:space="preserve"> 28×28 bitmaps. A PyTorch DCGAN with a 128-D latent vector trained for 30 epochs, using the DCGAN weight initialisation of Radford </w:t>
       </w:r>
       <w:r>
         <w:rPr>
@@ -1360,7 +1350,7 @@
       </w:r>
       <w:r>
         <w:rPr/>
-        <w:t xml:space="preserve"> (2016) and one-sided label smoothing. A convolutional model suits sketches because, like the OCT scans, they carry local stroke structure.</w:t>
+        <w:t xml:space="preserve"> (2016) and label smoothing; a convolutional model suits the local stroke structure.</w:t>
       </w:r>
     </w:p>
     <w:p>
@@ -1429,7 +1419,7 @@
       </w:pPr>
       <w:r>
         <w:rPr/>
-        <w:t xml:space="preserve">Figure 12 shows the generated cakes are clearly recognisable — most have a body shape with candle-like marks on top, and some include a plate or base line. They are not all clean (a few broken or doubled strokes, some background speckle), but the core silhouette is consistent across the grid, with no sign of mode collapse. Training was stable overall despite a brief spike at epoch 13 (D 1.633, G 11.493) that quickly recovered, and the model scored </w:t>
+        <w:t xml:space="preserve">Figure 12 shows the generated cakes are clearly recognisable — a body shape with candle-like marks on top, some with a plate or base line — though a few have broken strokes or speckle. The silhouette is consistent across the grid with no mode collapse. Training was stable apart from a brief epoch-13 spike (D 1.633, G 11.493) that recovered, and it scored </w:t>
       </w:r>
       <w:r>
         <w:rPr>
@@ -1451,11 +1441,11 @@
         <w:rPr>
           <w:b/>
         </w:rPr>
-        <w:t xml:space="preserve">Extension — other categories and sketch complexity.</w:t>
-      </w:r>
-      <w:r>
-        <w:rPr/>
-        <w:t xml:space="preserve"> The same pipeline was run on </w:t>
+        <w:t xml:space="preserve">Extension — other categories and complexity.</w:t>
+      </w:r>
+      <w:r>
+        <w:rPr/>
+        <w:t xml:space="preserve"> The same pipeline ran on </w:t>
       </w:r>
       <w:r>
         <w:rPr>
@@ -1475,7 +1465,7 @@
       </w:r>
       <w:r>
         <w:rPr/>
-        <w:t xml:space="preserve"> and the FID compared against an ink-density proxy for sketch complexity.</w:t>
+        <w:t xml:space="preserve">, comparing FID against an ink-density complexity proxy.</w:t>
       </w:r>
     </w:p>
     <w:p>
@@ -1544,7 +1534,7 @@
       </w:pPr>
       <w:r>
         <w:rPr/>
-        <w:t xml:space="preserve">Figure 13 shows ink density ordered as house (0.1725) &lt; cat (0.1986) &lt; cake (0.1989), and FID as house (</w:t>
+        <w:t xml:space="preserve">Figure 13 orders ink density as house (0.1725) &lt; cat (0.1986) &lt; cake (0.1989) and FID as house (</w:t>
       </w:r>
       <w:r>
         <w:rPr>
@@ -1574,7 +1564,7 @@
       </w:r>
       <w:r>
         <w:rPr/>
-        <w:t xml:space="preserve">). The sparsest category, house, is both the least inked and the easiest to model, supporting the intuition that emptier sketches are simpler. But cat and cake have almost identical ink density while cat scores clearly worse, so ink alone does not explain difficulty. The most plausible reading is that cat sketches vary far more in pose and internal detail (ears, whiskers, body angle) than cakes, and it is this structural variety, not the amount of ink, that makes the category harder.</w:t>
+        <w:t xml:space="preserve">). The sparsest category (house) is the easiest, supporting the idea that emptier sketches are simpler; but cat and cake have near-identical ink density while cat scores worse, so ink alone does not explain difficulty. Cat sketches vary far more in pose and detail (ears, whiskers, body angle), and it is that structural variety — not ink volume — that makes the category harder.</w:t>
       </w:r>
     </w:p>
     <w:p>
@@ -1593,17 +1583,17 @@
       </w:pPr>
       <w:r>
         <w:rPr/>
-        <w:t xml:space="preserve">Across all four experiments the same non-saturating adversarial objective was applied, but the architecture was matched to the data every time: dense MLPs for 2D points and tabular traffic, convolutional DCGANs for images and sketches, and a conditional variant where class control was needed. The from-scratch models converged to near-theoretical equilibria; the DCGANs produced recognisable OCT scans (FID 39.20) and birthday-cake sketches (FID 34.29); and the tabular GAN placed synthetic flows convincingly within the real distribution (alignment gaps 0.1227 / 0.2780, improving to 0.1059 / 0.2669 on the full dataset). The recurring limitation was under-dispersion — generators reproduce central tendency more faithfully than variance and fine detail — and, for imbalanced datasets, uneven quality across rare classes.</w:t>
-      </w:r>
-    </w:p>
-    <w:p>
-      <w:pPr>
-        <w:spacing w:after="160"/>
-        <w:jc w:val="both"/>
-      </w:pPr>
-      <w:r>
-        <w:rPr/>
-        <w:t xml:space="preserve">Future work follows directly from these weaknesses. Conditioning the CICIDS generator on attack family (as done for OCT) would let it allocate capacity to rare classes rather than defaulting to BENIGN; a Wasserstein objective with gradient penalty would likely improve tail coverage and the std-gap; and a domain-appropriate feature extractor for FID would give a fairer image score than ImageNet InceptionV3. Most importantly, the "duck test" analysis argues that any downstream use of this synthetic data — medical augmentation or IDS training — must be validated against real-only data before it is trusted.</w:t>
+        <w:t xml:space="preserve">The same non-saturating objective was applied throughout, but the architecture was matched to the data each time: dense MLPs for 2D points and tabular traffic, convolutional DCGANs for images and sketches, and a conditional variant for class control. The from-scratch models reached near-theoretical equilibria; the DCGANs produced recognisable OCT scans (FID 39.20) and cake sketches (FID 34.29); and the tabular GAN placed synthetic flows within the real distribution (gaps 0.1227 / 0.2780, improving to 0.1059 / 0.2669 across all days). The recurring limitation is under-dispersion — central tendency is reproduced more faithfully than variance and fine detail — together with uneven quality on rare classes.</w:t>
+      </w:r>
+    </w:p>
+    <w:p>
+      <w:pPr>
+        <w:spacing w:after="160"/>
+        <w:jc w:val="both"/>
+      </w:pPr>
+      <w:r>
+        <w:rPr/>
+        <w:t xml:space="preserve">Future work follows from these weaknesses: conditioning the CICIDS generator on attack family (as done for OCT) would help it serve rare classes rather than defaulting to BENIGN; a Wasserstein objective with gradient penalty should improve tail coverage and the std-gap; and a domain-appropriate feature extractor would give a fairer image score than ImageNet InceptionV3. Above all, the duck-test analysis means any downstream use of this synthetic data — medical augmentation or intrusion-detection training — must be validated against real-only data before it is trusted.</w:t>
       </w:r>
     </w:p>
     <w:p>
@@ -1612,7 +1602,7 @@
       </w:pPr>
       <w:r>
         <w:rPr/>
-        <w:t xml:space="preserve">5. References</w:t>
+        <w:t xml:space="preserve">References</w:t>
       </w:r>
     </w:p>
     <w:p>

</xml_diff>